<commit_message>
docs: aggiornamento completo manuali con Pexels + CI/CD + Lavoro Personalizzato
- Manuale generale: aggiunte tabelle servizi (Pexels, GitHub), sezione CI/CD attivo
- Conformità Legale: Pexels License + attribuzione fotografi (vs vecchia nota Unsplash)
- Roadmap: stato corrente aggiornato (Fase 0+1+1.5 completate, prossima Fase 2)

Co-Authored-By: Claude Opus 4.7 (1M context) <noreply@anthropic.com>
</commit_message>
<xml_diff>
--- a/docs/Conformita_Legale_Silvestre.docx
+++ b/docs/Conformita_Legale_Silvestre.docx
@@ -53,7 +53,7 @@
           <w:color w:val="7A7A7A"/>
           <w:sz w:val="20"/>
         </w:rPr>
-        <w:t>Versione del 17/05/2026</w:t>
+        <w:t>Versione del 18/05/2026</w:t>
       </w:r>
     </w:p>
     <w:p/>
@@ -2288,11 +2288,35 @@
       <w:r>
         <w:rPr>
           <w:rFonts w:ascii="Calibri" w:hAnsi="Calibri"/>
+          <w:b w:val="0"/>
+          <w:i w:val="0"/>
+          <w:color w:val="2B2B2B"/>
+          <w:sz w:val="22"/>
+        </w:rPr>
+        <w:t>Il catalogo usa immagini da Pexels (Pexels License) — 36 immagini scaricate via API Pexels e cachate in Firestore (collection 'catalog_images'). Pexels License consente uso commerciale gratuito; l'attribuzione non è obbligatoria ma 'gradita'. L'app mostra comunque l'attribuzione 'Photo by [Autore] - Pexels' come chip cliccabile su ogni scheda prodotto e categoria, per buona pratica e trasparenza.</w:t>
+      </w:r>
+    </w:p>
+    <w:p>
+      <w:r>
+        <w:rPr>
+          <w:rFonts w:ascii="Calibri" w:hAnsi="Calibri"/>
+          <w:b w:val="0"/>
+          <w:i w:val="0"/>
+          <w:color w:val="2B2B2B"/>
+          <w:sz w:val="22"/>
+        </w:rPr>
+        <w:t>Quando avrai tue foto reali dei prodotti, basta sostituirle nello stesso campo 'url' dei documenti 'catalog_images' su Firestore (o caricarle su Cloudinary e mettere l'URL Cloudinary). Le attribuzioni Pexels verranno automaticamente nascoste se il campo 'photographer' è vuoto.</w:t>
+      </w:r>
+    </w:p>
+    <w:p>
+      <w:r>
+        <w:rPr>
+          <w:rFonts w:ascii="Calibri" w:hAnsi="Calibri"/>
           <w:b/>
           <w:color w:val="D64545"/>
           <w:sz w:val="22"/>
         </w:rPr>
-        <w:t>⚠  Le immagini placeholder attualmente da LoremFlickr sono CC-BY (richiedono attribuzione). PRIMA DEL RILASCIO sostituire con: tue foto, foto Unsplash License (uso libero senza attribuzione), Pexels License, o stock a pagamento (Shutterstock, Adobe Stock).</w:t>
+        <w:t>⚠  Conserva sempre traccia della fonte di ogni immagine. Se sostituisci con foto tue, assicurati di avere liberatorie dai soggetti riconoscibili (modelle, bambini, persone identificabili in primo piano) — vedi sezione 4 GDPR diritti di immagine.</w:t>
       </w:r>
     </w:p>
     <w:p>
@@ -4413,6 +4437,147 @@
                 <w:rFonts w:ascii="Calibri" w:hAnsi="Calibri"/>
                 <w:sz w:val="21"/>
               </w:rPr>
+              <w:t>Stock photos free</w:t>
+            </w:r>
+          </w:p>
+        </w:tc>
+        <w:tc>
+          <w:tcPr>
+            <w:tcW w:type="dxa" w:w="2880"/>
+          </w:tcPr>
+          <w:p>
+            <w:r/>
+            <w:r>
+              <w:rPr>
+                <w:rFonts w:ascii="Calibri" w:hAnsi="Calibri"/>
+                <w:sz w:val="21"/>
+              </w:rPr>
+              <w:t>Pexels</w:t>
+            </w:r>
+          </w:p>
+        </w:tc>
+        <w:tc>
+          <w:tcPr>
+            <w:tcW w:type="dxa" w:w="2880"/>
+          </w:tcPr>
+          <w:p>
+            <w:r/>
+            <w:r>
+              <w:rPr>
+                <w:rFonts w:ascii="Calibri" w:hAnsi="Calibri"/>
+                <w:sz w:val="21"/>
+              </w:rPr>
+              <w:t>pexels.com</w:t>
+            </w:r>
+          </w:p>
+        </w:tc>
+      </w:tr>
+      <w:tr>
+        <w:tc>
+          <w:tcPr>
+            <w:tcW w:type="dxa" w:w="2880"/>
+          </w:tcPr>
+          <w:p>
+            <w:r/>
+            <w:r>
+              <w:rPr>
+                <w:rFonts w:ascii="Calibri" w:hAnsi="Calibri"/>
+                <w:sz w:val="21"/>
+              </w:rPr>
+              <w:t>CI/CD auto-deploy</w:t>
+            </w:r>
+          </w:p>
+        </w:tc>
+        <w:tc>
+          <w:tcPr>
+            <w:tcW w:type="dxa" w:w="2880"/>
+          </w:tcPr>
+          <w:p>
+            <w:r/>
+            <w:r>
+              <w:rPr>
+                <w:rFonts w:ascii="Calibri" w:hAnsi="Calibri"/>
+                <w:sz w:val="21"/>
+              </w:rPr>
+              <w:t>GitHub Actions</w:t>
+            </w:r>
+          </w:p>
+        </w:tc>
+        <w:tc>
+          <w:tcPr>
+            <w:tcW w:type="dxa" w:w="2880"/>
+          </w:tcPr>
+          <w:p>
+            <w:r/>
+            <w:r>
+              <w:rPr>
+                <w:rFonts w:ascii="Calibri" w:hAnsi="Calibri"/>
+                <w:sz w:val="21"/>
+              </w:rPr>
+              <w:t>github.com</w:t>
+            </w:r>
+          </w:p>
+        </w:tc>
+      </w:tr>
+      <w:tr>
+        <w:tc>
+          <w:tcPr>
+            <w:tcW w:type="dxa" w:w="2880"/>
+          </w:tcPr>
+          <w:p>
+            <w:r/>
+            <w:r>
+              <w:rPr>
+                <w:rFonts w:ascii="Calibri" w:hAnsi="Calibri"/>
+                <w:sz w:val="21"/>
+              </w:rPr>
+              <w:t>Image hosting</w:t>
+            </w:r>
+          </w:p>
+        </w:tc>
+        <w:tc>
+          <w:tcPr>
+            <w:tcW w:type="dxa" w:w="2880"/>
+          </w:tcPr>
+          <w:p>
+            <w:r/>
+            <w:r>
+              <w:rPr>
+                <w:rFonts w:ascii="Calibri" w:hAnsi="Calibri"/>
+                <w:sz w:val="21"/>
+              </w:rPr>
+              <w:t>Cloudinary</w:t>
+            </w:r>
+          </w:p>
+        </w:tc>
+        <w:tc>
+          <w:tcPr>
+            <w:tcW w:type="dxa" w:w="2880"/>
+          </w:tcPr>
+          <w:p>
+            <w:r/>
+            <w:r>
+              <w:rPr>
+                <w:rFonts w:ascii="Calibri" w:hAnsi="Calibri"/>
+                <w:sz w:val="21"/>
+              </w:rPr>
+              <w:t>cloudinary.com</w:t>
+            </w:r>
+          </w:p>
+        </w:tc>
+      </w:tr>
+      <w:tr>
+        <w:tc>
+          <w:tcPr>
+            <w:tcW w:type="dxa" w:w="2880"/>
+          </w:tcPr>
+          <w:p>
+            <w:r/>
+            <w:r>
+              <w:rPr>
+                <w:rFonts w:ascii="Calibri" w:hAnsi="Calibri"/>
+                <w:sz w:val="21"/>
+              </w:rPr>
               <w:t>Monitoring/Errori</w:t>
             </w:r>
           </w:p>
@@ -4491,53 +4656,6 @@
                 <w:sz w:val="21"/>
               </w:rPr>
               <w:t>plausible.io / umami.is</w:t>
-            </w:r>
-          </w:p>
-        </w:tc>
-      </w:tr>
-      <w:tr>
-        <w:tc>
-          <w:tcPr>
-            <w:tcW w:type="dxa" w:w="2880"/>
-          </w:tcPr>
-          <w:p>
-            <w:r/>
-            <w:r>
-              <w:rPr>
-                <w:rFonts w:ascii="Calibri" w:hAnsi="Calibri"/>
-                <w:sz w:val="21"/>
-              </w:rPr>
-              <w:t>Stock photos free</w:t>
-            </w:r>
-          </w:p>
-        </w:tc>
-        <w:tc>
-          <w:tcPr>
-            <w:tcW w:type="dxa" w:w="2880"/>
-          </w:tcPr>
-          <w:p>
-            <w:r/>
-            <w:r>
-              <w:rPr>
-                <w:rFonts w:ascii="Calibri" w:hAnsi="Calibri"/>
-                <w:sz w:val="21"/>
-              </w:rPr>
-              <w:t>Unsplash</w:t>
-            </w:r>
-          </w:p>
-        </w:tc>
-        <w:tc>
-          <w:tcPr>
-            <w:tcW w:type="dxa" w:w="2880"/>
-          </w:tcPr>
-          <w:p>
-            <w:r/>
-            <w:r>
-              <w:rPr>
-                <w:rFonts w:ascii="Calibri" w:hAnsi="Calibri"/>
-                <w:sz w:val="21"/>
-              </w:rPr>
-              <w:t>unsplash.com</w:t>
             </w:r>
           </w:p>
         </w:tc>

</xml_diff>